<commit_message>
Literature survey: add verified years and authors for papers 22 and 23 (Crossref)
Co-Authored-By: Claude Sonnet 5.5 <noreply@anthropic.com>
</commit_message>
<xml_diff>
--- a/Literature_Survey.docx
+++ b/Literature_Survey.docx
@@ -2638,7 +2638,7 @@
               <w:rPr>
                 <w:sz w:val="16"/>
               </w:rPr>
-              <w:t>verify</w:t>
+              <w:t>2025</w:t>
             </w:r>
           </w:p>
         </w:tc>
@@ -2757,7 +2757,7 @@
               <w:rPr>
                 <w:sz w:val="16"/>
               </w:rPr>
-              <w:t>Z. Zhang, C. Wan et al.</w:t>
+              <w:t>Z. Zhang, C. Wan, B. Cao, L. Zhao</w:t>
             </w:r>
           </w:p>
         </w:tc>
@@ -2776,7 +2776,7 @@
               <w:rPr>
                 <w:sz w:val="16"/>
               </w:rPr>
-              <w:t>verify</w:t>
+              <w:t>2026</w:t>
             </w:r>
           </w:p>
         </w:tc>
@@ -2920,7 +2920,10 @@
     </w:p>
     <w:p>
       <w:r>
-        <w:t>Extensions added 2026-10-22 (measured; see TESTING_AND_KNOWN_ISSUES 3.25-3.27): random bit-flip fuzzing of the LSTM weights (12,600 trials; exponent-MSB flips make 50.2 % of answers wrong, the envelope misses 34 % of wrong answers, the golden check misses none); cosign-signed golden outputs with fail-closed readiness and an admission policy (80 cluster trials); operator rollback and escalation (bad release: restart-only 0/5, release-aware rollback 46 s, escalate 77 s). Prior art: exponent bit-flip damage is known (Bit-Flip Attack, Rakin et al., ICCV 2019); model signing with hash manifests exists (OpenSSF/Sigstore); metric-based automated rollback exists (Argo Rollouts); the claims here are the measurements and the semantic-health-driven escalation, to our knowledge. Papers 22 and 23 are summarised from their abstracts; years and full author lists must be confirmed from the PDF or IEEE record.</w:t>
+        <w:t xml:space="preserve">Extensions added 2026-10-22 (measured; see TESTING_AND_KNOWN_ISSUES 3.25-3.27): random bit-flip fuzzing of the LSTM weights (12,600 trials; exponent-MSB flips make 50.2 % of answers wrong, the envelope misses 34 % of wrong answers, the golden check misses none); cosign-signed golden outputs with fail-closed readiness and an admission policy (80 cluster trials); operator rollback and escalation (bad release: restart-only 0/5, release-aware rollback 46 s, escalate 77 s). Prior art: exponent bit-flip damage is known (Bit-Flip Attack, Rakin et al., ICCV 2019); model signing with hash manifests exists (OpenSSF/Sigstore); metric-based automated rollback exists (Argo Rollouts); the claims here are the measurements and the semantic-health-driven escalation, to our knowledge. </w:t>
+      </w:r>
+      <w:r>
+        <w:t>Papers 22 (2025, Asilomar) and 23 (2026, AANN) are summarised from their abstracts; years and author lists come from a Crossref lookup and should still be confirmed on IEEE Xplore.</w:t>
       </w:r>
     </w:p>
     <w:sectPr>

</xml_diff>

<commit_message>
Correct paper years and authors from the PDFs (survey and report Table 2.1)
Years were read from the DOIs of the 21 PDFs: papers 1, 3, 14, 15, 16, 19 are 2026, paper 4 is 2023; the remaining inferred years were confirmed and the ~ marks removed.

Co-Authored-By: Claude Sonnet 5.5 <noreply@anthropic.com>
</commit_message>
<xml_diff>
--- a/Literature_Survey.docx
+++ b/Literature_Survey.docx
@@ -207,7 +207,7 @@
               <w:rPr>
                 <w:sz w:val="16"/>
               </w:rPr>
-              <w:t>2025</w:t>
+              <w:t>2026</w:t>
             </w:r>
           </w:p>
         </w:tc>
@@ -322,7 +322,7 @@
               <w:rPr>
                 <w:sz w:val="16"/>
               </w:rPr>
-              <w:t>~2025</w:t>
+              <w:t>2025</w:t>
             </w:r>
           </w:p>
         </w:tc>
@@ -437,7 +437,7 @@
               <w:rPr>
                 <w:sz w:val="16"/>
               </w:rPr>
-              <w:t>~2025</w:t>
+              <w:t>2026</w:t>
             </w:r>
           </w:p>
         </w:tc>
@@ -552,7 +552,7 @@
               <w:rPr>
                 <w:sz w:val="16"/>
               </w:rPr>
-              <w:t>~2024</w:t>
+              <w:t>2023</w:t>
             </w:r>
           </w:p>
         </w:tc>
@@ -667,7 +667,7 @@
               <w:rPr>
                 <w:sz w:val="16"/>
               </w:rPr>
-              <w:t>~2026</w:t>
+              <w:t>2026</w:t>
             </w:r>
           </w:p>
         </w:tc>
@@ -782,7 +782,7 @@
               <w:rPr>
                 <w:sz w:val="16"/>
               </w:rPr>
-              <w:t>~2022</w:t>
+              <w:t>2022</w:t>
             </w:r>
           </w:p>
         </w:tc>
@@ -881,7 +881,7 @@
               <w:rPr>
                 <w:sz w:val="16"/>
               </w:rPr>
-              <w:t>See PDF header</w:t>
+              <w:t>S. Shahini, H. Momeni</w:t>
             </w:r>
           </w:p>
         </w:tc>
@@ -1013,7 +1013,7 @@
               <w:rPr>
                 <w:sz w:val="16"/>
               </w:rPr>
-              <w:t>~2025</w:t>
+              <w:t>2025</w:t>
             </w:r>
           </w:p>
         </w:tc>
@@ -1243,7 +1243,7 @@
               <w:rPr>
                 <w:sz w:val="16"/>
               </w:rPr>
-              <w:t>~2022</w:t>
+              <w:t>2022</w:t>
             </w:r>
           </w:p>
         </w:tc>
@@ -1358,7 +1358,7 @@
               <w:rPr>
                 <w:sz w:val="16"/>
               </w:rPr>
-              <w:t>~2024</w:t>
+              <w:t>2024</w:t>
             </w:r>
           </w:p>
         </w:tc>
@@ -1473,7 +1473,7 @@
               <w:rPr>
                 <w:sz w:val="16"/>
               </w:rPr>
-              <w:t>~2023</w:t>
+              <w:t>2023</w:t>
             </w:r>
           </w:p>
         </w:tc>
@@ -1588,7 +1588,7 @@
               <w:rPr>
                 <w:sz w:val="16"/>
               </w:rPr>
-              <w:t>~2022</w:t>
+              <w:t>2022</w:t>
             </w:r>
           </w:p>
         </w:tc>
@@ -1687,7 +1687,7 @@
               <w:rPr>
                 <w:sz w:val="16"/>
               </w:rPr>
-              <w:t>See PDF header</w:t>
+              <w:t>R. Gangwar, V. Srivastava, P. Srivastava</w:t>
             </w:r>
           </w:p>
         </w:tc>
@@ -1703,7 +1703,7 @@
               <w:rPr>
                 <w:sz w:val="16"/>
               </w:rPr>
-              <w:t>~2025</w:t>
+              <w:t>2026</w:t>
             </w:r>
           </w:p>
         </w:tc>
@@ -1818,7 +1818,7 @@
               <w:rPr>
                 <w:sz w:val="16"/>
               </w:rPr>
-              <w:t>~2025</w:t>
+              <w:t>2026</w:t>
             </w:r>
           </w:p>
         </w:tc>
@@ -1933,7 +1933,7 @@
               <w:rPr>
                 <w:sz w:val="16"/>
               </w:rPr>
-              <w:t>~2025</w:t>
+              <w:t>2026</w:t>
             </w:r>
           </w:p>
         </w:tc>
@@ -2164,7 +2164,7 @@
               <w:rPr>
                 <w:sz w:val="16"/>
               </w:rPr>
-              <w:t>~2025</w:t>
+              <w:t>2025</w:t>
             </w:r>
           </w:p>
         </w:tc>
@@ -2279,7 +2279,7 @@
               <w:rPr>
                 <w:sz w:val="16"/>
               </w:rPr>
-              <w:t>~2025</w:t>
+              <w:t>2026</w:t>
             </w:r>
           </w:p>
         </w:tc>
@@ -2394,7 +2394,7 @@
               <w:rPr>
                 <w:sz w:val="16"/>
               </w:rPr>
-              <w:t>~2025</w:t>
+              <w:t>2025</w:t>
             </w:r>
           </w:p>
         </w:tc>
@@ -2884,7 +2884,6 @@
         <w:pStyle w:val="Heading1"/>
       </w:pPr>
       <w:r>
-        <w:lastRenderedPageBreak/>
         <w:t>Novelties of this project</w:t>
       </w:r>
     </w:p>

</xml_diff>